<commit_message>
RMF course: relative sample dates, accurate risk wording, learner-facing catalog
- POA&M sample milestones are computed from today's date.
- The single-instance decision is documented in the SSP (PL-2) with its risk
  response (RA-7); only the authorizing official accepts the risk (CA-6).
- Word catalog: production sections removed, full course title, properties,
  copyright footer; 10 pages. Web course copyright line.
- DAAG successor wording softened (effective date not confirmable here).
- Edition 1.3, updated 8 October 2026.

Co-Authored-By: Claude Opus 5.5 <noreply@anthropic.com>
Claude-Session: https://claude.ai/code/session_019wopQQuPwG5CcFGYaGF73Y
</commit_message>
<xml_diff>
--- a/public/training/rmf/Secure_By_Design_RMF_Training_Catalog.docx
+++ b/public/training/rmf/Secure_By_Design_RMF_Training_Catalog.docx
@@ -15,7 +15,7 @@
         <w:pStyle w:val="Title"/>
       </w:pPr>
       <w:r>
-        <w:t>RMF Body of Evidence and ATO Package Training Catalog</w:t>
+        <w:t xml:space="preserve">Risk Management Framework, Body of Evidence &amp; Authorization to Operate</w:t>
       </w:r>
     </w:p>
     <w:p>
@@ -28,12 +28,12 @@
     </w:p>
     <w:p>
       <w:r>
-        <w:t>Catalog 1.2  |  October 8, 2026</w:t>
+        <w:t xml:space="preserve">Training catalog · Edition 1.3  |  Updated October 8, 2026</w:t>
       </w:r>
     </w:p>
     <w:p>
       <w:r>
-        <w:t>Build the evidence behind an Authorization to Operate (ATO): how a system is secured, what has been assessed, what risk remains, and who decides whether that risk is acceptable. This catalog defines a progressive course for Secure By Design using one fictional, isolated enterprise throughout: the network built in Inside the Network.</w:t>
+        <w:t xml:space="preserve">Build the evidence behind an Authorization to Operate (ATO): how a system is secured, what has been assessed, what risk remains, and who decides whether that risk is acceptable. This progressive course uses one fictional, isolated enterprise throughout: the network built in Inside the Network.</w:t>
       </w:r>
     </w:p>
     <w:p>
@@ -146,7 +146,7 @@
                 <w:color w:val="FFFFFF"/>
                 <w:sz w:val="20"/>
               </w:rPr>
-              <w:t>Planned delivery</w:t>
+              <w:t xml:space="preserve">What to expect</w:t>
             </w:r>
           </w:p>
         </w:tc>
@@ -420,12 +420,12 @@
     </w:p>
     <w:p>
       <w:r>
-        <w:t>Every module follows Learn → See → Build → Prove. Major artifacts pair a blank template, a completed fictional example, and the supporting evidence. These are course production requirements; the catalog specifies the assets to develop.</w:t>
+        <w:t xml:space="preserve">Every module follows Learn → See → Build → Prove: read three short lessons, follow a worked example, build a practice artifact, then defend your work and check your understanding. Each artifact has a blank starter and a completed fictional example in the online Body of Evidence workspace at securebydesigninc.com/training/rmf.</w:t>
       </w:r>
     </w:p>
     <w:p>
       <w:r>
-        <w:t>The course can use supplied sample records without commercial tool access. Optional engineering exercises connect to the Inside the Network build from courses 1.1–1.12. Estimated time excludes building the underlying enterprise.</w:t>
+        <w:t xml:space="preserve">The supplied sample records are enough to complete the course; no commercial tool access is required. Optional engineering exercises connect to the Inside the Network build from courses 1.1–1.12. Estimated time excludes building the underlying enterprise.</w:t>
       </w:r>
     </w:p>
     <w:p>
@@ -2822,12 +2822,7 @@
     </w:p>
     <w:p>
       <w:r>
-        <w:t>The Inside the Network build supports an engineering team on an isolated network. Directory services, an internal certificate hierarchy, managed endpoints, a file service, centralized logging, vulnerability scanning, and offline backup copies are in scope for discussion. Learners must explicitly resolve the status of the virtualization platform and offline support processes.</w:t>
-      </w:r>
-    </w:p>
-    <w:p>
-      <w:r>
-        <w:t>Public training uses invented identities, records, and system details. No operational government package is needed to complete the exercises.</w:t>
+        <w:t xml:space="preserve">The Inside the Network build supports an engineering team on an isolated network; its directory, PKI, endpoint, file, logging, scanning, and offline backup services are in scope. Resolve the status of the virtualization platform and offline support processes. All records are invented, and no operational government package is needed.</w:t>
       </w:r>
     </w:p>
     <w:p>
@@ -3011,12 +3006,7 @@
     </w:p>
     <w:p>
       <w:r>
-        <w:t>The existing Design → Build → Configure → Harden → Validate → Document → Map workflow supplies the technical work for these modules. Learners bring one implemented capability forward and translate it into a documented control claim with supporting evidence.</w:t>
-      </w:r>
-    </w:p>
-    <w:p>
-      <w:r>
-        <w:t>Control examples are instructional selections, not a complete baseline. A STIG result, vulnerability scan, or installed security product is only part of the evidence needed to evaluate a control.</w:t>
+        <w:t xml:space="preserve">Courses 1.1–1.12 supply the technical work for these modules: bring one implemented capability forward as a documented control claim with supporting evidence. Control examples are teaching selections, not a complete baseline; a STIG result, scan, or installed product is only part of the evidence for a control.</w:t>
       </w:r>
     </w:p>
     <w:p>
@@ -4692,7 +4682,7 @@
     </w:p>
     <w:p>
       <w:r>
-        <w:t>For each major artifact, course production should deliver a blank template, an annotated completed example, linked supporting records, and a review checklist. No individual template should claim to be a universal government-approved form.</w:t>
+        <w:t xml:space="preserve">The starters and examples in the online Body of Evidence workspace are training templates, not universal government-approved forms.</w:t>
       </w:r>
     </w:p>
     <w:p>
@@ -5240,7 +5230,7 @@
               <w:rPr>
                 <w:sz w:val="20"/>
               </w:rPr>
-              <w:t>Update the SSP claim and executive summary. Show the AO what is known, what remains unverified, how the risk affects the mission, and what response is proposed. Present the recorded single-instance risk acceptance for Splunk, Nessus, and ePO (PL-2) separately from findings.</w:t>
+              <w:t xml:space="preserve">Update the SSP claim and executive summary. Show the AO what is known, what remains unverified, how the risk affects the mission, and what response is proposed. Present the single-instance design for Splunk, Nessus, and ePO separately from findings: the SSP documents it (PL-2), the risk response gives its rationale and mitigation (RA-7), and the AO decides whether to accept the risk (CA-6).</w:t>
             </w:r>
           </w:p>
         </w:tc>
@@ -5340,7 +5330,7 @@
         <w:pStyle w:val="ListBullet"/>
       </w:pPr>
       <w:r>
-        <w:t>At least two justified findings, contextual risk analysis, POA&amp;M entries, one remediation retest record, and the recorded single-instance risk acceptance.</w:t>
+        <w:t xml:space="preserve">At least two justified findings, contextual risk analysis, POA&amp;M entries, one remediation retest record, and the single-instance risk response (RA-7), documented in the SSP (PL-2) and presented for the AO’s acceptance decision (CA-6).</w:t>
       </w:r>
     </w:p>
     <w:p>
@@ -5963,7 +5953,7 @@
     </w:p>
     <w:p>
       <w:r>
-        <w:t>Recommended course completion threshold: 80 of 100 points, with revisions required for missing evidence behind a claimed successful assessment, inconsistent system boundaries, or a claim that the learner has granted an actual ATO. This is a proposed course standard, not an authorization criterion.</w:t>
+        <w:t xml:space="preserve">Course completion threshold: 80 of 100 points, with revisions required for missing evidence behind a claimed successful assessment, inconsistent system boundaries, or a claim that the learner has granted an actual ATO. This is a course standard, not an authorization criterion.</w:t>
       </w:r>
     </w:p>
     <w:p>
@@ -5971,12 +5961,12 @@
         <w:pStyle w:val="Heading2"/>
       </w:pPr>
       <w:r>
-        <w:t>Reviewer challenge prompts</w:t>
+        <w:t xml:space="preserve">Reviewer challenges</w:t>
       </w:r>
     </w:p>
     <w:p>
       <w:r>
-        <w:t>Introduce three changes during the review: an expired inherited-control reference; a scan with failed credentials; and a new service crossing the documented boundary. Ask the learner to explain the package impact, required follow-up, and decision owner.</w:t>
+        <w:t xml:space="preserve">Expect three changes during the review: an expired inherited-control reference, a scan with failed credentials, and a new service crossing the documented boundary. For each, explain the package impact, the required follow-up, and the decision owner.</w:t>
       </w:r>
     </w:p>
     <w:p>
@@ -5990,12 +5980,12 @@
         <w:pageBreakBefore/>
       </w:pPr>
       <w:r>
-        <w:t>Delivery and course production</w:t>
+        <w:t>Applicable guidance and references</w:t>
       </w:r>
     </w:p>
     <w:p>
       <w:r>
-        <w:t>Use one content structure across the Secure By Design website and cross-platform app. Present a stage overview, module list, lesson progress, artifact workspace, and capstone review. The catalog can support web, iOS, Android, and desktop use without tying the curriculum to a particular learning platform.</w:t>
+        <w:t xml:space="preserve">Choose the governing context before applying a template. NIST provides the RMF foundation; DoD, national security system, SAP, and DCSA requirements must be applied according to the responsible authority and the approved system context. Record the sources and versions you apply, and recheck them before each use.</w:t>
       </w:r>
     </w:p>
     <w:p>
@@ -6003,453 +5993,7 @@
         <w:pStyle w:val="Heading2"/>
       </w:pPr>
       <w:r>
-        <w:t>The repeatable lesson page</w:t>
-      </w:r>
-    </w:p>
-    <w:tbl>
-      <w:tblPr>
-        <w:tblW w:type="auto" w:w="0"/>
-        <w:jc w:val="center"/>
-        <w:tblLayout w:type="fixed"/>
-        <w:tblLook w:firstColumn="1" w:firstRow="1" w:lastColumn="0" w:lastRow="0" w:noHBand="0" w:noVBand="1" w:val="04A0"/>
-      </w:tblPr>
-      <w:tblGrid>
-        <w:gridCol w:w="1440"/>
-        <w:gridCol w:w="8784"/>
-      </w:tblGrid>
-      <w:tr>
-        <w:trPr>
-          <w:cantSplit/>
-          <w:tblHeader/>
-        </w:trPr>
-        <w:tc>
-          <w:tcPr>
-            <w:tcW w:type="dxa" w:w="1440"/>
-            <w:vAlign w:val="center"/>
-            <w:shd w:fill="173650"/>
-            <w:tcBorders>
-              <w:top w:val="single" w:sz="4" w:color="D9D9D9"/>
-              <w:left w:val="single" w:sz="4" w:color="D9D9D9"/>
-              <w:bottom w:val="single" w:sz="4" w:color="D9D9D9"/>
-              <w:right w:val="single" w:sz="4" w:color="D9D9D9"/>
-            </w:tcBorders>
-            <w:tcMar>
-              <w:top w:w="90" w:type="dxa"/>
-              <w:bottom w:w="90" w:type="dxa"/>
-              <w:left w:w="90" w:type="dxa"/>
-              <w:right w:w="90" w:type="dxa"/>
-            </w:tcMar>
-          </w:tcPr>
-          <w:p>
-            <w:pPr>
-              <w:spacing w:after="0" w:line="240" w:lineRule="auto"/>
-            </w:pPr>
-            <w:r>
-              <w:rPr>
-                <w:b/>
-                <w:color w:val="FFFFFF"/>
-                <w:sz w:val="20"/>
-              </w:rPr>
-              <w:t>Section</w:t>
-            </w:r>
-          </w:p>
-        </w:tc>
-        <w:tc>
-          <w:tcPr>
-            <w:tcW w:type="dxa" w:w="8784"/>
-            <w:vAlign w:val="center"/>
-            <w:shd w:fill="173650"/>
-            <w:tcBorders>
-              <w:top w:val="single" w:sz="4" w:color="D9D9D9"/>
-              <w:left w:val="single" w:sz="4" w:color="D9D9D9"/>
-              <w:bottom w:val="single" w:sz="4" w:color="D9D9D9"/>
-              <w:right w:val="single" w:sz="4" w:color="D9D9D9"/>
-            </w:tcBorders>
-            <w:tcMar>
-              <w:top w:w="90" w:type="dxa"/>
-              <w:bottom w:w="90" w:type="dxa"/>
-              <w:left w:w="90" w:type="dxa"/>
-              <w:right w:w="90" w:type="dxa"/>
-            </w:tcMar>
-          </w:tcPr>
-          <w:p>
-            <w:pPr>
-              <w:spacing w:after="0" w:line="240" w:lineRule="auto"/>
-            </w:pPr>
-            <w:r>
-              <w:rPr>
-                <w:b/>
-                <w:color w:val="FFFFFF"/>
-                <w:sz w:val="20"/>
-              </w:rPr>
-              <w:t>Student experience</w:t>
-            </w:r>
-          </w:p>
-        </w:tc>
-      </w:tr>
-      <w:tr>
-        <w:trPr>
-          <w:cantSplit/>
-        </w:trPr>
-        <w:tc>
-          <w:tcPr>
-            <w:tcW w:type="dxa" w:w="1440"/>
-            <w:vAlign w:val="center"/>
-            <w:shd w:fill="F0F4F7"/>
-            <w:tcBorders>
-              <w:top w:val="single" w:sz="4" w:color="D9D9D9"/>
-              <w:left w:val="single" w:sz="4" w:color="D9D9D9"/>
-              <w:bottom w:val="single" w:sz="4" w:color="D9D9D9"/>
-              <w:right w:val="single" w:sz="4" w:color="D9D9D9"/>
-            </w:tcBorders>
-            <w:tcMar>
-              <w:top w:w="90" w:type="dxa"/>
-              <w:bottom w:w="90" w:type="dxa"/>
-              <w:left w:w="90" w:type="dxa"/>
-              <w:right w:w="90" w:type="dxa"/>
-            </w:tcMar>
-          </w:tcPr>
-          <w:p>
-            <w:pPr>
-              <w:spacing w:after="0" w:line="240" w:lineRule="auto"/>
-            </w:pPr>
-            <w:r>
-              <w:rPr>
-                <w:sz w:val="20"/>
-              </w:rPr>
-              <w:t>Learn</w:t>
-            </w:r>
-          </w:p>
-        </w:tc>
-        <w:tc>
-          <w:tcPr>
-            <w:tcW w:type="dxa" w:w="8784"/>
-            <w:vAlign w:val="center"/>
-            <w:shd w:fill="F0F4F7"/>
-            <w:tcBorders>
-              <w:top w:val="single" w:sz="4" w:color="D9D9D9"/>
-              <w:left w:val="single" w:sz="4" w:color="D9D9D9"/>
-              <w:bottom w:val="single" w:sz="4" w:color="D9D9D9"/>
-              <w:right w:val="single" w:sz="4" w:color="D9D9D9"/>
-            </w:tcBorders>
-            <w:tcMar>
-              <w:top w:w="90" w:type="dxa"/>
-              <w:bottom w:w="90" w:type="dxa"/>
-              <w:left w:w="90" w:type="dxa"/>
-              <w:right w:w="90" w:type="dxa"/>
-            </w:tcMar>
-          </w:tcPr>
-          <w:p>
-            <w:pPr>
-              <w:spacing w:after="0" w:line="240" w:lineRule="auto"/>
-            </w:pPr>
-            <w:r>
-              <w:rPr>
-                <w:sz w:val="20"/>
-              </w:rPr>
-              <w:t>One clear objective, plain-language explanation, terms, and official references.</w:t>
-            </w:r>
-          </w:p>
-        </w:tc>
-      </w:tr>
-      <w:tr>
-        <w:trPr>
-          <w:cantSplit/>
-        </w:trPr>
-        <w:tc>
-          <w:tcPr>
-            <w:tcW w:type="dxa" w:w="1440"/>
-            <w:vAlign w:val="center"/>
-            <w:shd w:fill="FFFFFF"/>
-            <w:tcBorders>
-              <w:top w:val="single" w:sz="4" w:color="D9D9D9"/>
-              <w:left w:val="single" w:sz="4" w:color="D9D9D9"/>
-              <w:bottom w:val="single" w:sz="4" w:color="D9D9D9"/>
-              <w:right w:val="single" w:sz="4" w:color="D9D9D9"/>
-            </w:tcBorders>
-            <w:tcMar>
-              <w:top w:w="90" w:type="dxa"/>
-              <w:bottom w:w="90" w:type="dxa"/>
-              <w:left w:w="90" w:type="dxa"/>
-              <w:right w:w="90" w:type="dxa"/>
-            </w:tcMar>
-          </w:tcPr>
-          <w:p>
-            <w:pPr>
-              <w:spacing w:after="0" w:line="240" w:lineRule="auto"/>
-            </w:pPr>
-            <w:r>
-              <w:rPr>
-                <w:sz w:val="20"/>
-              </w:rPr>
-              <w:t>See</w:t>
-            </w:r>
-          </w:p>
-        </w:tc>
-        <w:tc>
-          <w:tcPr>
-            <w:tcW w:type="dxa" w:w="8784"/>
-            <w:vAlign w:val="center"/>
-            <w:shd w:fill="FFFFFF"/>
-            <w:tcBorders>
-              <w:top w:val="single" w:sz="4" w:color="D9D9D9"/>
-              <w:left w:val="single" w:sz="4" w:color="D9D9D9"/>
-              <w:bottom w:val="single" w:sz="4" w:color="D9D9D9"/>
-              <w:right w:val="single" w:sz="4" w:color="D9D9D9"/>
-            </w:tcBorders>
-            <w:tcMar>
-              <w:top w:w="90" w:type="dxa"/>
-              <w:bottom w:w="90" w:type="dxa"/>
-              <w:left w:w="90" w:type="dxa"/>
-              <w:right w:w="90" w:type="dxa"/>
-            </w:tcMar>
-          </w:tcPr>
-          <w:p>
-            <w:pPr>
-              <w:spacing w:after="0" w:line="240" w:lineRule="auto"/>
-            </w:pPr>
-            <w:r>
-              <w:rPr>
-                <w:sz w:val="20"/>
-              </w:rPr>
-              <w:t>An annotated artifact, architecture view, evidence trail, or short demonstration.</w:t>
-            </w:r>
-          </w:p>
-        </w:tc>
-      </w:tr>
-      <w:tr>
-        <w:trPr>
-          <w:cantSplit/>
-        </w:trPr>
-        <w:tc>
-          <w:tcPr>
-            <w:tcW w:type="dxa" w:w="1440"/>
-            <w:vAlign w:val="center"/>
-            <w:shd w:fill="F0F4F7"/>
-            <w:tcBorders>
-              <w:top w:val="single" w:sz="4" w:color="D9D9D9"/>
-              <w:left w:val="single" w:sz="4" w:color="D9D9D9"/>
-              <w:bottom w:val="single" w:sz="4" w:color="D9D9D9"/>
-              <w:right w:val="single" w:sz="4" w:color="D9D9D9"/>
-            </w:tcBorders>
-            <w:tcMar>
-              <w:top w:w="90" w:type="dxa"/>
-              <w:bottom w:w="90" w:type="dxa"/>
-              <w:left w:w="90" w:type="dxa"/>
-              <w:right w:w="90" w:type="dxa"/>
-            </w:tcMar>
-          </w:tcPr>
-          <w:p>
-            <w:pPr>
-              <w:spacing w:after="0" w:line="240" w:lineRule="auto"/>
-            </w:pPr>
-            <w:r>
-              <w:rPr>
-                <w:sz w:val="20"/>
-              </w:rPr>
-              <w:t>Build</w:t>
-            </w:r>
-          </w:p>
-        </w:tc>
-        <w:tc>
-          <w:tcPr>
-            <w:tcW w:type="dxa" w:w="8784"/>
-            <w:vAlign w:val="center"/>
-            <w:shd w:fill="F0F4F7"/>
-            <w:tcBorders>
-              <w:top w:val="single" w:sz="4" w:color="D9D9D9"/>
-              <w:left w:val="single" w:sz="4" w:color="D9D9D9"/>
-              <w:bottom w:val="single" w:sz="4" w:color="D9D9D9"/>
-              <w:right w:val="single" w:sz="4" w:color="D9D9D9"/>
-            </w:tcBorders>
-            <w:tcMar>
-              <w:top w:w="90" w:type="dxa"/>
-              <w:bottom w:w="90" w:type="dxa"/>
-              <w:left w:w="90" w:type="dxa"/>
-              <w:right w:w="90" w:type="dxa"/>
-            </w:tcMar>
-          </w:tcPr>
-          <w:p>
-            <w:pPr>
-              <w:spacing w:after="0" w:line="240" w:lineRule="auto"/>
-            </w:pPr>
-            <w:r>
-              <w:rPr>
-                <w:sz w:val="20"/>
-              </w:rPr>
-              <w:t>A scoped task with prerequisites, supplied records, and a blank artifact where needed.</w:t>
-            </w:r>
-          </w:p>
-        </w:tc>
-      </w:tr>
-      <w:tr>
-        <w:trPr>
-          <w:cantSplit/>
-        </w:trPr>
-        <w:tc>
-          <w:tcPr>
-            <w:tcW w:type="dxa" w:w="1440"/>
-            <w:vAlign w:val="center"/>
-            <w:shd w:fill="FFFFFF"/>
-            <w:tcBorders>
-              <w:top w:val="single" w:sz="4" w:color="D9D9D9"/>
-              <w:left w:val="single" w:sz="4" w:color="D9D9D9"/>
-              <w:bottom w:val="single" w:sz="4" w:color="D9D9D9"/>
-              <w:right w:val="single" w:sz="4" w:color="D9D9D9"/>
-            </w:tcBorders>
-            <w:tcMar>
-              <w:top w:w="90" w:type="dxa"/>
-              <w:bottom w:w="90" w:type="dxa"/>
-              <w:left w:w="90" w:type="dxa"/>
-              <w:right w:w="90" w:type="dxa"/>
-            </w:tcMar>
-          </w:tcPr>
-          <w:p>
-            <w:pPr>
-              <w:spacing w:after="0" w:line="240" w:lineRule="auto"/>
-            </w:pPr>
-            <w:r>
-              <w:rPr>
-                <w:sz w:val="20"/>
-              </w:rPr>
-              <w:t>Prove</w:t>
-            </w:r>
-          </w:p>
-        </w:tc>
-        <w:tc>
-          <w:tcPr>
-            <w:tcW w:type="dxa" w:w="8784"/>
-            <w:vAlign w:val="center"/>
-            <w:shd w:fill="FFFFFF"/>
-            <w:tcBorders>
-              <w:top w:val="single" w:sz="4" w:color="D9D9D9"/>
-              <w:left w:val="single" w:sz="4" w:color="D9D9D9"/>
-              <w:bottom w:val="single" w:sz="4" w:color="D9D9D9"/>
-              <w:right w:val="single" w:sz="4" w:color="D9D9D9"/>
-            </w:tcBorders>
-            <w:tcMar>
-              <w:top w:w="90" w:type="dxa"/>
-              <w:bottom w:w="90" w:type="dxa"/>
-              <w:left w:w="90" w:type="dxa"/>
-              <w:right w:w="90" w:type="dxa"/>
-            </w:tcMar>
-          </w:tcPr>
-          <w:p>
-            <w:pPr>
-              <w:spacing w:after="0" w:line="240" w:lineRule="auto"/>
-            </w:pPr>
-            <w:r>
-              <w:rPr>
-                <w:sz w:val="20"/>
-              </w:rPr>
-              <w:t>An expected output, quality checklist, feedback, and a question that requires justification.</w:t>
-            </w:r>
-          </w:p>
-        </w:tc>
-      </w:tr>
-    </w:tbl>
-    <w:p>
-      <w:pPr>
-        <w:spacing w:after="0"/>
-      </w:pPr>
-      <w:r/>
-    </w:p>
-    <w:p>
-      <w:pPr>
-        <w:pStyle w:val="Heading2"/>
-      </w:pPr>
-      <w:r>
-        <w:t>First lesson ready for development</w:t>
-      </w:r>
-    </w:p>
-    <w:p>
-      <w:r>
-        <w:t>RMF 01.1, “Risk and mission impact,” introduces why an ATO requires evidence. Open with this scenario: a team has installed security tools and finished its checklist; a reviewer asks what supports the claim that the system is safe to operate.</w:t>
-      </w:r>
-    </w:p>
-    <w:p>
-      <w:r>
-        <w:t>Show a five-part example: requirement, implementation, evidence, assessment, and risk decision. Have learners classify a configuration export, an analyst review ticket, an SAR finding, and an authorization decision. Finish by asking who can accept the remaining risk and what information that person needs.</w:t>
-      </w:r>
-    </w:p>
-    <w:p>
-      <w:pPr>
-        <w:pStyle w:val="Heading2"/>
-      </w:pPr>
-      <w:r>
-        <w:t>Recommended production order</w:t>
-      </w:r>
-    </w:p>
-    <w:p>
-      <w:pPr>
-        <w:pStyle w:val="ListBullet"/>
-      </w:pPr>
-      <w:r>
-        <w:t>First, establish the fictional system dossier, stable asset identifiers, source/version register, and one complete example evidence trail.</w:t>
-      </w:r>
-    </w:p>
-    <w:p>
-      <w:pPr>
-        <w:pStyle w:val="ListBullet"/>
-      </w:pPr>
-      <w:r>
-        <w:t>Next, produce Modules 01–03 and the boundary/categorization exercises. Use their outputs as the fixed starting point for later lessons.</w:t>
-      </w:r>
-    </w:p>
-    <w:p>
-      <w:pPr>
-        <w:pStyle w:val="ListBullet"/>
-      </w:pPr>
-      <w:r>
-        <w:t>Then develop Modules 04–09, the artifact templates, completed examples, assessment records, and answer guidance together so they remain consistent.</w:t>
-      </w:r>
-    </w:p>
-    <w:p>
-      <w:pPr>
-        <w:pStyle w:val="ListBullet"/>
-      </w:pPr>
-      <w:r>
-        <w:t>Finally, develop Modules 10–12, the capstone, rubric, review challenges, and the module progress experience.</w:t>
-      </w:r>
-    </w:p>
-    <w:p>
-      <w:pPr>
-        <w:pStyle w:val="Heading2"/>
-      </w:pPr>
-      <w:r>
-        <w:t>Release checklist</w:t>
-      </w:r>
-    </w:p>
-    <w:p>
-      <w:r>
-        <w:t>Before publishing a module, verify its cited guidance, control version, terminology, artifact links, expected answers, and consistency with the fictional dossier. Provide captions for videos, text alternatives for visuals, and downloadable exercise files. Keep lesson completion distinct from evidence submission and reviewer acceptance.</w:t>
-      </w:r>
-    </w:p>
-    <w:p>
-      <w:r>
-        <w:t>Use short concept videos alongside written exercises. Each module can also provide a public introductory video that leads into the structured course and its practical assignment.</w:t>
-      </w:r>
-    </w:p>
-    <w:p>
-      <w:pPr>
-        <w:pStyle w:val="Heading1"/>
-        <w:pageBreakBefore/>
-      </w:pPr>
-      <w:r>
-        <w:t>Applicable guidance and references</w:t>
-      </w:r>
-    </w:p>
-    <w:p>
-      <w:r>
-        <w:t>Choose the governing context before applying a template. NIST provides the RMF foundation; DoD, national security system, SAP, and DCSA requirements must be applied according to the responsible authority and the approved system context. Keep a source/version register and recheck it before releasing lessons.</w:t>
-      </w:r>
-    </w:p>
-    <w:p>
-      <w:pPr>
-        <w:pStyle w:val="Heading2"/>
-      </w:pPr>
-      <w:r>
-        <w:t>Guidance distinctions to teach</w:t>
+        <w:t xml:space="preserve">Distinctions the course teaches</w:t>
       </w:r>
     </w:p>
     <w:p>
@@ -6473,7 +6017,7 @@
         <w:pStyle w:val="ListBullet"/>
       </w:pPr>
       <w:r>
-        <w:t>DCSA context: DCSA announced that DAAG would replace DAAPM on October 1, 2025. The current guide and applicable supporting instructions must be obtained through the authorized DCSA channels. Do not label DAAPM 2.2 as the current governing manual. [7]</w:t>
+        <w:t xml:space="preserve">DCSA context: DCSA has announced the DCSA Assessment and Authorization Guide (DAAG) as the successor to the DAAPM. Confirm the version and effective date that apply, obtain the guide and supporting instructions through authorized DCSA channels, and check whether DAAPM 2.2 still applies before citing it as the governing manual. [7]</w:t>
       </w:r>
     </w:p>
     <w:p>
@@ -6670,7 +6214,7 @@
         <w:rPr>
           <w:sz w:val="20"/>
         </w:rPr>
-        <w:t xml:space="preserve"> — Official announcement of the October 1, 2025 DAAG transition.</w:t>
+        <w:t xml:space="preserve"> — DCSA newsletter for cleared industry on the DAAG transition. Confirm the current guide and effective date with DCSA.</w:t>
       </w:r>
     </w:p>
     <w:p>
@@ -6703,7 +6247,7 @@
       <w:rPr>
         <w:sz w:val="18"/>
       </w:rPr>
-      <w:t xml:space="preserve">Secure By Design  |  </w:t>
+      <w:t xml:space="preserve">© 2026 Secure By Design Team LLC  |  </w:t>
     </w:r>
     <w:fldSimple w:instr="PAGE"/>
   </w:p>

</xml_diff>

<commit_message>
Update the RMF Word catalog's build-course range to 1.1-1.10
Co-Authored-By: Claude Opus 5.5 <noreply@anthropic.com>
Claude-Session: https://claude.ai/code/session_01KXpABti7gZjF9vATjgu9Pb
</commit_message>
<xml_diff>
--- a/public/training/rmf/Secure_By_Design_RMF_Training_Catalog.docx
+++ b/public/training/rmf/Secure_By_Design_RMF_Training_Catalog.docx
@@ -425,7 +425,7 @@
     </w:p>
     <w:p>
       <w:r>
-        <w:t xml:space="preserve">The supplied sample records are enough to complete the course; no commercial tool access is required. Optional engineering exercises connect to the Inside the Network build from courses 1.1–1.12. Estimated time excludes building the underlying enterprise.</w:t>
+        <w:t>The supplied sample records are enough to complete the course; no commercial tool access is required. Optional engineering exercises connect to the Inside the Network build from courses 1.1–1.10. Estimated time excludes building the underlying enterprise.</w:t>
       </w:r>
     </w:p>
     <w:p>
@@ -3006,7 +3006,7 @@
     </w:p>
     <w:p>
       <w:r>
-        <w:t xml:space="preserve">Courses 1.1–1.12 supply the technical work for these modules: bring one implemented capability forward as a documented control claim with supporting evidence. Control examples are teaching selections, not a complete baseline; a STIG result, scan, or installed product is only part of the evidence for a control.</w:t>
+        <w:t>Courses 1.1–1.10 supply the technical work for these modules: bring one implemented capability forward as a documented control claim with supporting evidence. Control examples are teaching selections, not a complete baseline; a STIG result, scan, or installed product is only part of the evidence for a control.</w:t>
       </w:r>
     </w:p>
     <w:p>

</xml_diff>